<commit_message>
chore: actualizacion completa mayo 2026 — traspaso del sistema
- CLAUDE.md: seccion START HERE para desarrollador que retoma el proyecto
- MonitoreoLockerTiempoReal.ps1 v2.0: fix bug marcador + reconstruccion semanal
- GenerarDashboard.ps1: version actual en produccion (confirmada 2026-05-20)
- BackupHistorial.ps1 + EjecutarBackupOculto.vbs: scripts de backup anadidos
- MonitoreoLockerTiempoReal_v1_BACKUP.ps1: backup de la version anterior
- Documentacion mantenimiento actualizada

Co-Authored-By: Claude Sonnet 4.6 <noreply@anthropic.com>
</commit_message>
<xml_diff>
--- a/LOCKER - Matenimiento para un futuro (lo mas reciente).docx
+++ b/LOCKER - Matenimiento para un futuro (lo mas reciente).docx
@@ -2,41 +2,378 @@
 <file path=word/document.xml><?xml version="1.0" encoding="utf-8"?>
 <w:document xmlns:wpc="http://schemas.microsoft.com/office/word/2010/wordprocessingCanvas" xmlns:mc="http://schemas.openxmlformats.org/markup-compatibility/2006" xmlns:o="urn:schemas-microsoft-com:office:office" xmlns:r="http://schemas.openxmlformats.org/officeDocument/2006/relationships" xmlns:m="http://schemas.openxmlformats.org/officeDocument/2006/math" xmlns:v="urn:schemas-microsoft-com:vml" xmlns:wp14="http://schemas.microsoft.com/office/word/2010/wordprocessingDrawing" xmlns:wp="http://schemas.openxmlformats.org/drawingml/2006/wordprocessingDrawing" xmlns:w10="urn:schemas-microsoft-com:office:word" xmlns:w="http://schemas.openxmlformats.org/wordprocessingml/2006/main" xmlns:w14="http://schemas.microsoft.com/office/word/2010/wordml" xmlns:w15="http://schemas.microsoft.com/office/word/2012/wordml" xmlns:wpg="http://schemas.microsoft.com/office/word/2010/wordprocessingGroup" xmlns:wpi="http://schemas.microsoft.com/office/word/2010/wordprocessingInk" xmlns:wne="http://schemas.microsoft.com/office/word/2006/wordml" xmlns:wps="http://schemas.microsoft.com/office/word/2010/wordprocessingShape" xmlns:w16se="http://schemas.microsoft.com/office/word/2015/wordml/symex" xmlns:w16cid="http://schemas.microsoft.com/office/word/2016/wordml/cid" xmlns:w16="http://schemas.microsoft.com/office/word/2018/wordml" xmlns:w16cex="http://schemas.microsoft.com/office/word/2018/wordml/cex" xmlns:w16sdtdh="http://schemas.microsoft.com/office/word/2020/wordml/sdtdatahash" xmlns:w16sdtfl="http://schemas.microsoft.com/office/word/2024/wordml/sdtformatlock" mc:Ignorable="w14 w15 wp14 w16se w16cid w16 w16cex w16sdtdh w16sdtfl">
   <w:body>
-    <w:p xmlns:wp14="http://schemas.microsoft.com/office/word/2010/wordml" wp14:paraId="5C1A07E2" wp14:textId="373BB8F0">
-      <w:r>
-        <w:rPr/>
-        <w:t xml:space="preserve">Ya hemos hecho que se actualize todo al momento (eso en </w:t>
-      </w:r>
-      <w:r>
-        <w:rPr/>
-        <w:t>teoria</w:t>
-      </w:r>
-      <w:r>
-        <w:rPr/>
-        <w:t xml:space="preserve"> no hace falta tocar ya)</w:t>
-      </w:r>
-    </w:p>
-    <w:p/>
-    <w:p/>
     <w:p>
-      <w:r>
-        <w:rPr/>
-        <w:t>()</w:t>
-      </w:r>
+      <w:pPr>
+        <w:pStyle w:val="Normal"/>
+        <w:jc w:val="center"/>
+        <w:rPr>
+          <w:rFonts w:ascii="Calibri" w:hAnsi="Calibri" w:eastAsia="Calibri" w:cs="Calibri"/>
+          <w:b w:val="1"/>
+          <w:bCs w:val="1"/>
+          <w:sz w:val="24"/>
+          <w:szCs w:val="24"/>
+        </w:rPr>
+      </w:pPr>
     </w:p>
     <w:p>
       <w:pPr>
-        <w:rPr>
-          <w:sz w:val="16"/>
-          <w:szCs w:val="16"/>
-        </w:rPr>
-      </w:pPr>
-      <w:r>
-        <w:rPr>
-          <w:sz w:val="16"/>
-          <w:szCs w:val="16"/>
-        </w:rPr>
-        <w:t>*****SEGUIR EL MANTENIMIENTO:</w:t>
+        <w:pStyle w:val="Normal"/>
+        <w:rPr>
+          <w:rFonts w:ascii="Calibri" w:hAnsi="Calibri" w:eastAsia="Calibri" w:cs="Calibri"/>
+          <w:sz w:val="24"/>
+          <w:szCs w:val="24"/>
+        </w:rPr>
+      </w:pPr>
+    </w:p>
+    <w:p>
+      <w:pPr>
+        <w:pStyle w:val="Normal"/>
+        <w:rPr>
+          <w:rFonts w:ascii="Calibri" w:hAnsi="Calibri" w:eastAsia="Calibri" w:cs="Calibri"/>
+          <w:sz w:val="24"/>
+          <w:szCs w:val="24"/>
+        </w:rPr>
+      </w:pPr>
+      <w:r>
+        <w:rPr>
+          <w:rFonts w:ascii="Calibri" w:hAnsi="Calibri" w:eastAsia="Calibri" w:cs="Calibri"/>
+          <w:sz w:val="24"/>
+          <w:szCs w:val="24"/>
+        </w:rPr>
+        <w:t>Ir mirando de vez en cuando si está todo en orden</w:t>
+      </w:r>
+      <w:r>
+        <w:rPr>
+          <w:rFonts w:ascii="Calibri" w:hAnsi="Calibri" w:eastAsia="Calibri" w:cs="Calibri"/>
+          <w:sz w:val="24"/>
+          <w:szCs w:val="24"/>
+        </w:rPr>
+        <w:t xml:space="preserve"> (si pasa algo, si hace falta usar </w:t>
+      </w:r>
+      <w:r>
+        <w:rPr>
+          <w:rFonts w:ascii="Calibri" w:hAnsi="Calibri" w:eastAsia="Calibri" w:cs="Calibri"/>
+          <w:sz w:val="24"/>
+          <w:szCs w:val="24"/>
+        </w:rPr>
+        <w:t>Team</w:t>
+      </w:r>
+      <w:r>
+        <w:rPr>
+          <w:rFonts w:ascii="Calibri" w:hAnsi="Calibri" w:eastAsia="Calibri" w:cs="Calibri"/>
+          <w:sz w:val="24"/>
+          <w:szCs w:val="24"/>
+        </w:rPr>
+        <w:t xml:space="preserve"> </w:t>
+      </w:r>
+      <w:r>
+        <w:rPr>
+          <w:rFonts w:ascii="Calibri" w:hAnsi="Calibri" w:eastAsia="Calibri" w:cs="Calibri"/>
+          <w:sz w:val="24"/>
+          <w:szCs w:val="24"/>
+        </w:rPr>
+        <w:t>Viewer</w:t>
+      </w:r>
+      <w:r>
+        <w:rPr>
+          <w:rFonts w:ascii="Calibri" w:hAnsi="Calibri" w:eastAsia="Calibri" w:cs="Calibri"/>
+          <w:sz w:val="24"/>
+          <w:szCs w:val="24"/>
+        </w:rPr>
+        <w:t xml:space="preserve"> para ver </w:t>
+      </w:r>
+      <w:r>
+        <w:rPr>
+          <w:rFonts w:ascii="Calibri" w:hAnsi="Calibri" w:eastAsia="Calibri" w:cs="Calibri"/>
+          <w:sz w:val="24"/>
+          <w:szCs w:val="24"/>
+        </w:rPr>
+        <w:t>que</w:t>
+      </w:r>
+      <w:r>
+        <w:rPr>
+          <w:rFonts w:ascii="Calibri" w:hAnsi="Calibri" w:eastAsia="Calibri" w:cs="Calibri"/>
+          <w:sz w:val="24"/>
+          <w:szCs w:val="24"/>
+        </w:rPr>
+        <w:t xml:space="preserve"> pasa (Powershell </w:t>
+      </w:r>
+      <w:r>
+        <w:rPr>
+          <w:rFonts w:ascii="Calibri" w:hAnsi="Calibri" w:eastAsia="Calibri" w:cs="Calibri"/>
+          <w:sz w:val="24"/>
+          <w:szCs w:val="24"/>
+        </w:rPr>
+        <w:t>ordenador</w:t>
+      </w:r>
+      <w:r>
+        <w:rPr>
+          <w:rFonts w:ascii="Calibri" w:hAnsi="Calibri" w:eastAsia="Calibri" w:cs="Calibri"/>
+          <w:sz w:val="24"/>
+          <w:szCs w:val="24"/>
+        </w:rPr>
+        <w:t xml:space="preserve"> </w:t>
+      </w:r>
+      <w:r>
+        <w:rPr>
+          <w:rFonts w:ascii="Calibri" w:hAnsi="Calibri" w:eastAsia="Calibri" w:cs="Calibri"/>
+          <w:sz w:val="24"/>
+          <w:szCs w:val="24"/>
+        </w:rPr>
+        <w:t>locker</w:t>
+      </w:r>
+      <w:r>
+        <w:rPr>
+          <w:rFonts w:ascii="Calibri" w:hAnsi="Calibri" w:eastAsia="Calibri" w:cs="Calibri"/>
+          <w:sz w:val="24"/>
+          <w:szCs w:val="24"/>
+        </w:rPr>
+        <w:t>...)</w:t>
+      </w:r>
+    </w:p>
+    <w:p>
+      <w:pPr>
+        <w:pStyle w:val="Normal"/>
+        <w:rPr>
+          <w:color w:val="0E2740"/>
+          <w:sz w:val="24"/>
+          <w:szCs w:val="24"/>
+        </w:rPr>
+      </w:pPr>
+    </w:p>
+    <w:p>
+      <w:pPr>
+        <w:pStyle w:val="Normal"/>
+        <w:rPr>
+          <w:color w:val="0E2740"/>
+          <w:sz w:val="24"/>
+          <w:szCs w:val="24"/>
+        </w:rPr>
+      </w:pPr>
+    </w:p>
+    <w:p>
+      <w:pPr>
+        <w:pStyle w:val="Normal"/>
+        <w:rPr>
+          <w:rFonts w:ascii="Calibri" w:hAnsi="Calibri" w:eastAsia="Calibri" w:cs="Calibri"/>
+          <w:b w:val="0"/>
+          <w:bCs w:val="0"/>
+          <w:color w:val="auto"/>
+          <w:sz w:val="24"/>
+          <w:szCs w:val="24"/>
+        </w:rPr>
+      </w:pPr>
+      <w:r>
+        <w:rPr>
+          <w:rFonts w:ascii="Calibri" w:hAnsi="Calibri" w:eastAsia="Calibri" w:cs="Calibri"/>
+          <w:b w:val="0"/>
+          <w:bCs w:val="0"/>
+          <w:color w:val="auto"/>
+          <w:sz w:val="24"/>
+          <w:szCs w:val="24"/>
+        </w:rPr>
+        <w:t xml:space="preserve">Cada 50 </w:t>
+      </w:r>
+      <w:r>
+        <w:rPr>
+          <w:rFonts w:ascii="Calibri" w:hAnsi="Calibri" w:eastAsia="Calibri" w:cs="Calibri"/>
+          <w:b w:val="0"/>
+          <w:bCs w:val="0"/>
+          <w:color w:val="auto"/>
+          <w:sz w:val="24"/>
+          <w:szCs w:val="24"/>
+        </w:rPr>
+        <w:t>dias</w:t>
+      </w:r>
+      <w:r>
+        <w:rPr>
+          <w:rFonts w:ascii="Calibri" w:hAnsi="Calibri" w:eastAsia="Calibri" w:cs="Calibri"/>
+          <w:b w:val="0"/>
+          <w:bCs w:val="0"/>
+          <w:color w:val="auto"/>
+          <w:sz w:val="24"/>
+          <w:szCs w:val="24"/>
+        </w:rPr>
+        <w:t xml:space="preserve">, se cambia la contraseña del </w:t>
+      </w:r>
+      <w:r>
+        <w:rPr>
+          <w:rFonts w:ascii="Calibri" w:hAnsi="Calibri" w:eastAsia="Calibri" w:cs="Calibri"/>
+          <w:b w:val="0"/>
+          <w:bCs w:val="0"/>
+          <w:color w:val="auto"/>
+          <w:sz w:val="24"/>
+          <w:szCs w:val="24"/>
+        </w:rPr>
+        <w:t>ordenador</w:t>
+      </w:r>
+      <w:r>
+        <w:rPr>
+          <w:rFonts w:ascii="Calibri" w:hAnsi="Calibri" w:eastAsia="Calibri" w:cs="Calibri"/>
+          <w:b w:val="0"/>
+          <w:bCs w:val="0"/>
+          <w:color w:val="auto"/>
+          <w:sz w:val="24"/>
+          <w:szCs w:val="24"/>
+        </w:rPr>
+        <w:t xml:space="preserve"> del </w:t>
+      </w:r>
+      <w:r>
+        <w:rPr>
+          <w:rFonts w:ascii="Calibri" w:hAnsi="Calibri" w:eastAsia="Calibri" w:cs="Calibri"/>
+          <w:b w:val="0"/>
+          <w:bCs w:val="0"/>
+          <w:color w:val="auto"/>
+          <w:sz w:val="24"/>
+          <w:szCs w:val="24"/>
+        </w:rPr>
+        <w:t>locker</w:t>
+      </w:r>
+      <w:r>
+        <w:rPr>
+          <w:rFonts w:ascii="Calibri" w:hAnsi="Calibri" w:eastAsia="Calibri" w:cs="Calibri"/>
+          <w:b w:val="0"/>
+          <w:bCs w:val="0"/>
+          <w:color w:val="auto"/>
+          <w:sz w:val="24"/>
+          <w:szCs w:val="24"/>
+        </w:rPr>
+        <w:t xml:space="preserve">. Iniciar </w:t>
+      </w:r>
+      <w:r>
+        <w:rPr>
+          <w:rFonts w:ascii="Calibri" w:hAnsi="Calibri" w:eastAsia="Calibri" w:cs="Calibri"/>
+          <w:b w:val="0"/>
+          <w:bCs w:val="0"/>
+          <w:color w:val="auto"/>
+          <w:sz w:val="24"/>
+          <w:szCs w:val="24"/>
+        </w:rPr>
+        <w:t>sesion</w:t>
+      </w:r>
+      <w:r>
+        <w:rPr>
+          <w:rFonts w:ascii="Calibri" w:hAnsi="Calibri" w:eastAsia="Calibri" w:cs="Calibri"/>
+          <w:b w:val="0"/>
+          <w:bCs w:val="0"/>
+          <w:color w:val="auto"/>
+          <w:sz w:val="24"/>
+          <w:szCs w:val="24"/>
+        </w:rPr>
+        <w:t xml:space="preserve"> con la nueva, para que se pueda seguir sincronizando con OneDrive</w:t>
+      </w:r>
+      <w:r>
+        <w:rPr>
+          <w:rFonts w:ascii="Calibri" w:hAnsi="Calibri" w:eastAsia="Calibri" w:cs="Calibri"/>
+          <w:b w:val="0"/>
+          <w:bCs w:val="0"/>
+          <w:color w:val="auto"/>
+          <w:sz w:val="24"/>
+          <w:szCs w:val="24"/>
+        </w:rPr>
+        <w:t xml:space="preserve"> (con </w:t>
+      </w:r>
+      <w:r>
+        <w:rPr>
+          <w:rFonts w:ascii="Calibri" w:hAnsi="Calibri" w:eastAsia="Calibri" w:cs="Calibri"/>
+          <w:b w:val="0"/>
+          <w:bCs w:val="0"/>
+          <w:color w:val="auto"/>
+          <w:sz w:val="24"/>
+          <w:szCs w:val="24"/>
+        </w:rPr>
+        <w:t>Team</w:t>
+      </w:r>
+      <w:r>
+        <w:rPr>
+          <w:rFonts w:ascii="Calibri" w:hAnsi="Calibri" w:eastAsia="Calibri" w:cs="Calibri"/>
+          <w:b w:val="0"/>
+          <w:bCs w:val="0"/>
+          <w:color w:val="auto"/>
+          <w:sz w:val="24"/>
+          <w:szCs w:val="24"/>
+        </w:rPr>
+        <w:t xml:space="preserve"> </w:t>
+      </w:r>
+      <w:r>
+        <w:rPr>
+          <w:rFonts w:ascii="Calibri" w:hAnsi="Calibri" w:eastAsia="Calibri" w:cs="Calibri"/>
+          <w:b w:val="0"/>
+          <w:bCs w:val="0"/>
+          <w:color w:val="auto"/>
+          <w:sz w:val="24"/>
+          <w:szCs w:val="24"/>
+        </w:rPr>
+        <w:t>Viewer</w:t>
+      </w:r>
+      <w:r>
+        <w:rPr>
+          <w:rFonts w:ascii="Calibri" w:hAnsi="Calibri" w:eastAsia="Calibri" w:cs="Calibri"/>
+          <w:b w:val="0"/>
+          <w:bCs w:val="0"/>
+          <w:color w:val="auto"/>
+          <w:sz w:val="24"/>
+          <w:szCs w:val="24"/>
+        </w:rPr>
+        <w:t>, o sino intentar sin ello?)</w:t>
+      </w:r>
+    </w:p>
+    <w:p>
+      <w:pPr>
+        <w:pStyle w:val="Normal"/>
+        <w:rPr>
+          <w:rFonts w:ascii="Calibri" w:hAnsi="Calibri" w:eastAsia="Calibri" w:cs="Calibri"/>
+          <w:b w:val="0"/>
+          <w:bCs w:val="0"/>
+          <w:color w:val="auto"/>
+        </w:rPr>
+      </w:pPr>
+    </w:p>
+    <w:p>
+      <w:pPr>
+        <w:pStyle w:val="Normal"/>
+        <w:rPr>
+          <w:rFonts w:ascii="Calibri" w:hAnsi="Calibri" w:eastAsia="Calibri" w:cs="Calibri"/>
+          <w:b w:val="0"/>
+          <w:bCs w:val="0"/>
+          <w:color w:val="auto"/>
+        </w:rPr>
+      </w:pPr>
+    </w:p>
+    <w:p>
+      <w:pPr>
+        <w:pStyle w:val="Normal"/>
+        <w:ind w:left="0"/>
+        <w:rPr>
+          <w:rFonts w:ascii="Calibri" w:hAnsi="Calibri" w:eastAsia="Calibri" w:cs="Calibri"/>
+          <w:b w:val="0"/>
+          <w:bCs w:val="0"/>
+          <w:color w:val="auto"/>
+          <w:sz w:val="24"/>
+          <w:szCs w:val="24"/>
+        </w:rPr>
+      </w:pPr>
+      <w:r>
+        <w:rPr>
+          <w:rFonts w:ascii="Calibri" w:hAnsi="Calibri" w:eastAsia="Calibri" w:cs="Calibri"/>
+          <w:b w:val="0"/>
+          <w:bCs w:val="0"/>
+          <w:color w:val="auto"/>
+          <w:sz w:val="24"/>
+          <w:szCs w:val="24"/>
+        </w:rPr>
+        <w:t>Cuando se calibren los instrumentos</w:t>
+      </w:r>
+      <w:r>
+        <w:rPr>
+          <w:rFonts w:ascii="Calibri" w:hAnsi="Calibri" w:eastAsia="Calibri" w:cs="Calibri"/>
+          <w:b w:val="0"/>
+          <w:bCs w:val="0"/>
+          <w:color w:val="auto"/>
+          <w:sz w:val="24"/>
+          <w:szCs w:val="24"/>
+        </w:rPr>
+        <w:t>:</w:t>
       </w:r>
     </w:p>
     <w:p>
@@ -44,43 +381,149 @@
         <w:pStyle w:val="ListParagraph"/>
         <w:numPr>
           <w:ilvl w:val="0"/>
-          <w:numId w:val="1"/>
+          <w:numId w:val="2"/>
         </w:numPr>
         <w:rPr>
-          <w:sz w:val="16"/>
-          <w:szCs w:val="16"/>
-        </w:rPr>
-      </w:pPr>
-      <w:r>
-        <w:rPr>
-          <w:sz w:val="16"/>
-          <w:szCs w:val="16"/>
-        </w:rPr>
-        <w:t>Fechas de caducidad: Actualizar en el Excel</w:t>
-      </w:r>
-      <w:r>
-        <w:rPr>
-          <w:sz w:val="16"/>
-          <w:szCs w:val="16"/>
-        </w:rPr>
-        <w:t xml:space="preserve"> (calibración, </w:t>
-      </w:r>
-      <w:r>
-        <w:rPr>
-          <w:sz w:val="16"/>
-          <w:szCs w:val="16"/>
+          <w:rFonts w:ascii="Calibri" w:hAnsi="Calibri" w:eastAsia="Calibri" w:cs="Calibri"/>
+          <w:b w:val="0"/>
+          <w:bCs w:val="0"/>
+          <w:color w:val="auto" w:themeColor="text2" w:themeTint="80" w:themeShade="FF"/>
+          <w:sz w:val="24"/>
+          <w:szCs w:val="24"/>
+        </w:rPr>
+      </w:pPr>
+      <w:r>
+        <w:rPr>
+          <w:rFonts w:ascii="Calibri" w:hAnsi="Calibri" w:eastAsia="Calibri" w:cs="Calibri"/>
+          <w:b w:val="0"/>
+          <w:bCs w:val="0"/>
+          <w:color w:val="auto"/>
+          <w:sz w:val="24"/>
+          <w:szCs w:val="24"/>
+        </w:rPr>
+        <w:t>C</w:t>
+      </w:r>
+      <w:r>
+        <w:rPr>
+          <w:rFonts w:ascii="Calibri" w:hAnsi="Calibri" w:eastAsia="Calibri" w:cs="Calibri"/>
+          <w:b w:val="0"/>
+          <w:bCs w:val="0"/>
+          <w:color w:val="auto"/>
+          <w:sz w:val="24"/>
+          <w:szCs w:val="24"/>
+        </w:rPr>
+        <w:t xml:space="preserve">ambiar la nueva fecha de caducidad en la aplicación del </w:t>
+      </w:r>
+      <w:r>
+        <w:rPr>
+          <w:rFonts w:ascii="Calibri" w:hAnsi="Calibri" w:eastAsia="Calibri" w:cs="Calibri"/>
+          <w:b w:val="0"/>
+          <w:bCs w:val="0"/>
+          <w:color w:val="auto"/>
+          <w:sz w:val="24"/>
+          <w:szCs w:val="24"/>
+        </w:rPr>
+        <w:t>locker</w:t>
+      </w:r>
+      <w:r>
+        <w:rPr>
+          <w:rFonts w:ascii="Calibri" w:hAnsi="Calibri" w:eastAsia="Calibri" w:cs="Calibri"/>
+          <w:b w:val="0"/>
+          <w:bCs w:val="0"/>
+          <w:color w:val="auto"/>
+          <w:sz w:val="24"/>
+          <w:szCs w:val="24"/>
+        </w:rPr>
+        <w:t xml:space="preserve"> (ACTUM EPI VISOR)</w:t>
+      </w:r>
+      <w:r>
+        <w:rPr>
+          <w:rFonts w:ascii="Calibri" w:hAnsi="Calibri" w:eastAsia="Calibri" w:cs="Calibri"/>
+          <w:b w:val="0"/>
+          <w:bCs w:val="0"/>
+          <w:color w:val="auto"/>
+          <w:sz w:val="24"/>
+          <w:szCs w:val="24"/>
+        </w:rPr>
+        <w:t xml:space="preserve">, y se actualiza solo en </w:t>
+      </w:r>
+      <w:r>
+        <w:rPr>
+          <w:rFonts w:ascii="Calibri" w:hAnsi="Calibri" w:eastAsia="Calibri" w:cs="Calibri"/>
+          <w:b w:val="0"/>
+          <w:bCs w:val="0"/>
+          <w:color w:val="auto"/>
+          <w:sz w:val="24"/>
+          <w:szCs w:val="24"/>
+        </w:rPr>
+        <w:t>Dashboard</w:t>
+      </w:r>
+      <w:r>
+        <w:rPr>
+          <w:rFonts w:ascii="Calibri" w:hAnsi="Calibri" w:eastAsia="Calibri" w:cs="Calibri"/>
+          <w:b w:val="0"/>
+          <w:bCs w:val="0"/>
+          <w:color w:val="auto"/>
+          <w:sz w:val="24"/>
+          <w:szCs w:val="24"/>
+        </w:rPr>
+        <w:t>Admin</w:t>
+      </w:r>
+      <w:r>
+        <w:rPr>
+          <w:rFonts w:ascii="Calibri" w:hAnsi="Calibri" w:eastAsia="Calibri" w:cs="Calibri"/>
+          <w:b w:val="0"/>
+          <w:bCs w:val="0"/>
+          <w:color w:val="auto"/>
+          <w:sz w:val="24"/>
+          <w:szCs w:val="24"/>
+        </w:rPr>
+        <w:t xml:space="preserve"> (y si eso actualizarlo </w:t>
+      </w:r>
+      <w:r>
+        <w:rPr>
+          <w:rFonts w:ascii="Calibri" w:hAnsi="Calibri" w:eastAsia="Calibri" w:cs="Calibri"/>
+          <w:b w:val="0"/>
+          <w:bCs w:val="0"/>
+          <w:color w:val="auto"/>
+          <w:sz w:val="24"/>
+          <w:szCs w:val="24"/>
         </w:rPr>
         <w:t>tambien</w:t>
       </w:r>
       <w:r>
         <w:rPr>
-          <w:sz w:val="16"/>
-          <w:szCs w:val="16"/>
-        </w:rPr>
-        <w:t xml:space="preserve"> cambiar a mano en el Excel) </w:t>
-      </w:r>
-      <w:r>
-        <w:tab/>
+          <w:rFonts w:ascii="Calibri" w:hAnsi="Calibri" w:eastAsia="Calibri" w:cs="Calibri"/>
+          <w:b w:val="0"/>
+          <w:bCs w:val="0"/>
+          <w:color w:val="auto"/>
+          <w:sz w:val="24"/>
+          <w:szCs w:val="24"/>
+        </w:rPr>
+        <w:t xml:space="preserve"> en el Excel de INSTRUMENTOS LOCKER)</w:t>
+      </w:r>
+      <w:r>
+        <w:rPr>
+          <w:rFonts w:ascii="Calibri" w:hAnsi="Calibri" w:eastAsia="Calibri" w:cs="Calibri"/>
+          <w:b w:val="0"/>
+          <w:bCs w:val="0"/>
+          <w:color w:val="auto"/>
+          <w:sz w:val="24"/>
+          <w:szCs w:val="24"/>
+        </w:rPr>
+        <w:t xml:space="preserve"> </w:t>
+      </w:r>
+      <w:r>
+        <w:rPr>
+          <w:rFonts w:ascii="Calibri" w:hAnsi="Calibri" w:eastAsia="Calibri" w:cs="Calibri"/>
+          <w:b w:val="0"/>
+          <w:bCs w:val="0"/>
+          <w:color w:val="auto"/>
+          <w:sz w:val="24"/>
+          <w:szCs w:val="24"/>
+          <w:u w:val="single"/>
+        </w:rPr>
+        <w:t>(carpeta compartida)</w:t>
       </w:r>
     </w:p>
     <w:p>
@@ -88,352 +531,39 @@
         <w:pStyle w:val="ListParagraph"/>
         <w:numPr>
           <w:ilvl w:val="0"/>
-          <w:numId w:val="1"/>
+          <w:numId w:val="2"/>
         </w:numPr>
         <w:rPr>
-          <w:sz w:val="16"/>
-          <w:szCs w:val="16"/>
-        </w:rPr>
-      </w:pPr>
-      <w:r>
-        <w:rPr>
-          <w:sz w:val="16"/>
-          <w:szCs w:val="16"/>
-        </w:rPr>
-        <w:t xml:space="preserve">Añadir/Quitar </w:t>
-      </w:r>
-      <w:r>
-        <w:rPr>
-          <w:sz w:val="16"/>
-          <w:szCs w:val="16"/>
-        </w:rPr>
-        <w:t>instrumentos</w:t>
-      </w:r>
-      <w:r>
-        <w:rPr>
-          <w:sz w:val="16"/>
-          <w:szCs w:val="16"/>
-        </w:rPr>
-        <w:t>???</w:t>
-      </w:r>
-    </w:p>
-    <w:p>
-      <w:pPr>
-        <w:pStyle w:val="ListParagraph"/>
-        <w:numPr>
-          <w:ilvl w:val="0"/>
-          <w:numId w:val="1"/>
-        </w:numPr>
-        <w:rPr>
-          <w:sz w:val="16"/>
-          <w:szCs w:val="16"/>
-        </w:rPr>
-      </w:pPr>
-      <w:r>
-        <w:rPr>
-          <w:sz w:val="16"/>
-          <w:szCs w:val="16"/>
-        </w:rPr>
-        <w:t>Añadir/Quitar usuarios?</w:t>
-      </w:r>
-    </w:p>
-    <w:p>
-      <w:pPr>
-        <w:pStyle w:val="Normal"/>
-        <w:rPr>
-          <w:sz w:val="16"/>
-          <w:szCs w:val="16"/>
-        </w:rPr>
-      </w:pPr>
-    </w:p>
-    <w:p>
-      <w:pPr>
-        <w:pStyle w:val="Normal"/>
-        <w:rPr>
-          <w:sz w:val="16"/>
-          <w:szCs w:val="16"/>
-        </w:rPr>
-      </w:pPr>
-      <w:r>
-        <w:rPr>
-          <w:sz w:val="16"/>
-          <w:szCs w:val="16"/>
-        </w:rPr>
-        <w:t>UNA VEZ QUE HAGAMOS EL CAMBIO, LO QUE HACE FALTA, ACTUALIZARLO EN EL HTML</w:t>
-      </w:r>
-    </w:p>
-    <w:p>
-      <w:pPr>
-        <w:pStyle w:val="Normal"/>
-        <w:rPr>
-          <w:sz w:val="24"/>
-          <w:szCs w:val="24"/>
-        </w:rPr>
-      </w:pPr>
-      <w:r>
-        <w:rPr>
-          <w:sz w:val="24"/>
-          <w:szCs w:val="24"/>
-        </w:rPr>
-        <w:t>()</w:t>
-      </w:r>
-    </w:p>
-    <w:p>
-      <w:pPr>
-        <w:pStyle w:val="Normal"/>
-        <w:rPr>
-          <w:sz w:val="24"/>
-          <w:szCs w:val="24"/>
-        </w:rPr>
-      </w:pPr>
-    </w:p>
-    <w:p>
-      <w:pPr>
-        <w:pStyle w:val="Normal"/>
-        <w:rPr>
-          <w:sz w:val="24"/>
-          <w:szCs w:val="24"/>
-        </w:rPr>
-      </w:pPr>
-    </w:p>
-    <w:p>
-      <w:pPr>
-        <w:pStyle w:val="Normal"/>
-        <w:rPr>
-          <w:sz w:val="24"/>
-          <w:szCs w:val="24"/>
-        </w:rPr>
-      </w:pPr>
-      <w:r>
-        <w:rPr>
-          <w:sz w:val="24"/>
-          <w:szCs w:val="24"/>
-        </w:rPr>
-        <w:t xml:space="preserve">SI HACE FALTA PARA ALGO, PUEDE QUE TENGA QUE RENOVAR EL TEAM VIEWER </w:t>
-      </w:r>
-    </w:p>
-    <w:p>
-      <w:pPr>
-        <w:pStyle w:val="Normal"/>
-        <w:rPr>
-          <w:sz w:val="24"/>
-          <w:szCs w:val="24"/>
-        </w:rPr>
-      </w:pPr>
-    </w:p>
-    <w:p>
-      <w:pPr>
-        <w:pStyle w:val="Normal"/>
-        <w:rPr>
-          <w:color w:val="156082" w:themeColor="accent1" w:themeTint="FF" w:themeShade="FF"/>
-          <w:sz w:val="24"/>
-          <w:szCs w:val="24"/>
-        </w:rPr>
-      </w:pPr>
-      <w:r>
-        <w:rPr>
-          <w:color w:val="156082" w:themeColor="accent1" w:themeTint="FF" w:themeShade="FF"/>
-          <w:sz w:val="24"/>
-          <w:szCs w:val="24"/>
-        </w:rPr>
-        <w:t>EN PRINCIPIO</w:t>
-      </w:r>
-      <w:r>
-        <w:rPr>
-          <w:color w:val="156082" w:themeColor="accent1" w:themeTint="FF" w:themeShade="FF"/>
-          <w:sz w:val="24"/>
-          <w:szCs w:val="24"/>
-        </w:rPr>
-        <w:t xml:space="preserve">, EL </w:t>
-      </w:r>
-      <w:r>
-        <w:rPr>
-          <w:b w:val="1"/>
-          <w:bCs w:val="1"/>
-          <w:color w:val="156082" w:themeColor="accent1" w:themeTint="FF" w:themeShade="FF"/>
+          <w:rFonts w:ascii="Calibri" w:hAnsi="Calibri" w:eastAsia="Calibri" w:cs="Calibri"/>
+          <w:b w:val="0"/>
+          <w:bCs w:val="0"/>
+          <w:color w:val="auto"/>
+          <w:sz w:val="24"/>
+          <w:szCs w:val="24"/>
+        </w:rPr>
+      </w:pPr>
+      <w:r>
+        <w:rPr>
+          <w:rFonts w:ascii="Calibri" w:hAnsi="Calibri" w:eastAsia="Calibri" w:cs="Calibri"/>
+          <w:b w:val="0"/>
+          <w:bCs w:val="0"/>
+          <w:color w:val="auto"/>
+          <w:sz w:val="24"/>
+          <w:szCs w:val="24"/>
+        </w:rPr>
+        <w:t xml:space="preserve">Subir los certificados de calibración a la </w:t>
+      </w:r>
+      <w:r>
+        <w:rPr>
+          <w:rFonts w:ascii="Calibri" w:hAnsi="Calibri" w:eastAsia="Calibri" w:cs="Calibri"/>
+          <w:b w:val="0"/>
+          <w:bCs w:val="0"/>
+          <w:color w:val="auto"/>
           <w:sz w:val="24"/>
           <w:szCs w:val="24"/>
           <w:u w:val="single"/>
         </w:rPr>
-        <w:t>Dashb</w:t>
-      </w:r>
-      <w:r>
-        <w:rPr>
-          <w:b w:val="1"/>
-          <w:bCs w:val="1"/>
-          <w:color w:val="156082" w:themeColor="accent1" w:themeTint="FF" w:themeShade="FF"/>
-          <w:sz w:val="24"/>
-          <w:szCs w:val="24"/>
-          <w:u w:val="single"/>
-        </w:rPr>
-        <w:t>oard</w:t>
-      </w:r>
-      <w:r>
-        <w:rPr>
-          <w:b w:val="1"/>
-          <w:bCs w:val="1"/>
-          <w:color w:val="156082" w:themeColor="accent1" w:themeTint="FF" w:themeShade="FF"/>
-          <w:sz w:val="24"/>
-          <w:szCs w:val="24"/>
-          <w:u w:val="single"/>
-        </w:rPr>
-        <w:t>Locker</w:t>
-      </w:r>
-      <w:r>
-        <w:rPr>
-          <w:color w:val="156082" w:themeColor="accent1" w:themeTint="FF" w:themeShade="FF"/>
-          <w:sz w:val="24"/>
-          <w:szCs w:val="24"/>
-        </w:rPr>
-        <w:t xml:space="preserve"> SE MANTIENE SOLO (cualquier cosa que cambie en el ACTUM EPI Visor se actualiza solo)</w:t>
-      </w:r>
-    </w:p>
-    <w:p>
-      <w:pPr>
-        <w:pStyle w:val="Normal"/>
-        <w:rPr>
-          <w:color w:val="0E2740"/>
-          <w:sz w:val="24"/>
-          <w:szCs w:val="24"/>
-        </w:rPr>
-      </w:pPr>
-    </w:p>
-    <w:p>
-      <w:pPr>
-        <w:pStyle w:val="Normal"/>
-        <w:rPr>
-          <w:color w:val="0E2740"/>
-          <w:sz w:val="24"/>
-          <w:szCs w:val="24"/>
-        </w:rPr>
-      </w:pPr>
-    </w:p>
-    <w:p>
-      <w:pPr>
-        <w:pStyle w:val="Normal"/>
-        <w:rPr>
-          <w:color w:val="4EA72E" w:themeColor="accent6" w:themeTint="FF" w:themeShade="FF"/>
-          <w:sz w:val="24"/>
-          <w:szCs w:val="24"/>
-        </w:rPr>
-      </w:pPr>
-      <w:r>
-        <w:rPr>
-          <w:color w:val="4EA72E" w:themeColor="accent6" w:themeTint="FF" w:themeShade="FF"/>
-          <w:sz w:val="24"/>
-          <w:szCs w:val="24"/>
-        </w:rPr>
-        <w:t xml:space="preserve">EN PRINCIPIO, EL </w:t>
-      </w:r>
-      <w:r>
-        <w:rPr>
-          <w:b w:val="1"/>
-          <w:bCs w:val="1"/>
-          <w:color w:val="4EA72E" w:themeColor="accent6" w:themeTint="FF" w:themeShade="FF"/>
-          <w:sz w:val="24"/>
-          <w:szCs w:val="24"/>
-        </w:rPr>
-        <w:t>DashboardLockerAdmin</w:t>
-      </w:r>
-      <w:r>
-        <w:rPr>
-          <w:color w:val="4EA72E" w:themeColor="accent6" w:themeTint="FF" w:themeShade="FF"/>
-          <w:sz w:val="24"/>
-          <w:szCs w:val="24"/>
-        </w:rPr>
-        <w:t xml:space="preserve"> SE MANTIENE SOLO (cualquier cosa que cambie en el ACTUM EPI Visor se actualiza solo), pero lo </w:t>
-      </w:r>
-      <w:bookmarkStart w:name="_Int_AGLPTTbw" w:id="1107364795"/>
-      <w:r>
-        <w:rPr>
-          <w:color w:val="4EA72E" w:themeColor="accent6" w:themeTint="FF" w:themeShade="FF"/>
-          <w:sz w:val="24"/>
-          <w:szCs w:val="24"/>
-        </w:rPr>
-        <w:t>que</w:t>
-      </w:r>
-      <w:bookmarkEnd w:id="1107364795"/>
-      <w:r>
-        <w:rPr>
-          <w:color w:val="4EA72E" w:themeColor="accent6" w:themeTint="FF" w:themeShade="FF"/>
-          <w:sz w:val="24"/>
-          <w:szCs w:val="24"/>
-        </w:rPr>
-        <w:t xml:space="preserve"> si hay que decirle es en el registro de uso desde cuando empezar a contar los usos, es decir, desde que se mandan a calibrar (y eso depende de cuando se mane a calibrar </w:t>
-      </w:r>
-      <w:r>
-        <w:rPr>
-          <w:color w:val="4EA72E" w:themeColor="accent6" w:themeTint="FF" w:themeShade="FF"/>
-          <w:sz w:val="24"/>
-          <w:szCs w:val="24"/>
-        </w:rPr>
-        <w:t>cada</w:t>
-      </w:r>
-      <w:r>
-        <w:rPr>
-          <w:color w:val="4EA72E" w:themeColor="accent6" w:themeTint="FF" w:themeShade="FF"/>
-          <w:sz w:val="24"/>
-          <w:szCs w:val="24"/>
-        </w:rPr>
-        <w:t xml:space="preserve"> año)</w:t>
-      </w:r>
-    </w:p>
-    <w:p>
-      <w:pPr>
-        <w:pStyle w:val="Normal"/>
-        <w:rPr>
-          <w:color w:val="0E2740"/>
-          <w:sz w:val="24"/>
-          <w:szCs w:val="24"/>
-        </w:rPr>
-      </w:pPr>
-    </w:p>
-    <w:p>
-      <w:pPr>
-        <w:pStyle w:val="Normal"/>
-        <w:rPr>
-          <w:color w:val="0E2740" w:themeColor="text2" w:themeTint="80" w:themeShade="FF"/>
-          <w:sz w:val="24"/>
-          <w:szCs w:val="24"/>
-        </w:rPr>
-      </w:pPr>
-      <w:r>
-        <w:rPr>
-          <w:color w:val="auto"/>
-          <w:sz w:val="24"/>
-          <w:szCs w:val="24"/>
-        </w:rPr>
-        <w:t>(cuando vuelvan de calibrar, guardar los archivos</w:t>
-      </w:r>
-      <w:r>
-        <w:rPr>
-          <w:color w:val="auto"/>
-          <w:sz w:val="24"/>
-          <w:szCs w:val="24"/>
-        </w:rPr>
-        <w:t xml:space="preserve"> ((donde certifica que esta calibrado (fecha) y cuando caduca)</w:t>
-      </w:r>
-      <w:r>
-        <w:rPr>
-          <w:color w:val="auto"/>
-          <w:sz w:val="24"/>
-          <w:szCs w:val="24"/>
-        </w:rPr>
-        <w:t xml:space="preserve"> </w:t>
-      </w:r>
-      <w:r>
-        <w:rPr>
-          <w:color w:val="auto"/>
-          <w:sz w:val="24"/>
-          <w:szCs w:val="24"/>
-        </w:rPr>
-        <w:t>en la carpeta de GHI del locker)</w:t>
-      </w:r>
-      <w:r>
-        <w:br/>
-      </w:r>
-      <w:r>
-        <w:br/>
+        <w:t>carpeta compartida</w:t>
       </w:r>
     </w:p>
     <w:sectPr>
@@ -465,6 +595,230 @@
 
 <file path=word/numbering.xml><?xml version="1.0" encoding="utf-8"?>
 <w:numbering xmlns:w="http://schemas.openxmlformats.org/wordprocessingml/2006/main">
+  <w:abstractNum xmlns:w="http://schemas.openxmlformats.org/wordprocessingml/2006/main" w:abstractNumId="3">
+    <w:nsid w:val="19c69629"/>
+    <w:multiLevelType xmlns:w="http://schemas.openxmlformats.org/wordprocessingml/2006/main" w:val="hybridMultilevel"/>
+    <w:lvl xmlns:w="http://schemas.openxmlformats.org/wordprocessingml/2006/main" w:ilvl="0">
+      <w:start w:val="1"/>
+      <w:numFmt w:val="bullet"/>
+      <w:lvlText w:val=""/>
+      <w:lvlJc w:val="left"/>
+      <w:pPr>
+        <w:ind w:left="720" w:hanging="360"/>
+      </w:pPr>
+      <w:rPr>
+        <w:rFonts w:hint="default" w:ascii="Symbol" w:hAnsi="Symbol"/>
+      </w:rPr>
+    </w:lvl>
+    <w:lvl xmlns:w="http://schemas.openxmlformats.org/wordprocessingml/2006/main" w:ilvl="1">
+      <w:start w:val="1"/>
+      <w:numFmt w:val="bullet"/>
+      <w:lvlText w:val="o"/>
+      <w:lvlJc w:val="left"/>
+      <w:pPr>
+        <w:ind w:left="1440" w:hanging="360"/>
+      </w:pPr>
+      <w:rPr>
+        <w:rFonts w:hint="default" w:ascii="Courier New" w:hAnsi="Courier New"/>
+      </w:rPr>
+    </w:lvl>
+    <w:lvl xmlns:w="http://schemas.openxmlformats.org/wordprocessingml/2006/main" w:ilvl="2">
+      <w:start w:val="1"/>
+      <w:numFmt w:val="bullet"/>
+      <w:lvlText w:val=""/>
+      <w:lvlJc w:val="left"/>
+      <w:pPr>
+        <w:ind w:left="2160" w:hanging="360"/>
+      </w:pPr>
+      <w:rPr>
+        <w:rFonts w:hint="default" w:ascii="Wingdings" w:hAnsi="Wingdings"/>
+      </w:rPr>
+    </w:lvl>
+    <w:lvl xmlns:w="http://schemas.openxmlformats.org/wordprocessingml/2006/main" w:ilvl="3">
+      <w:start w:val="1"/>
+      <w:numFmt w:val="bullet"/>
+      <w:lvlText w:val=""/>
+      <w:lvlJc w:val="left"/>
+      <w:pPr>
+        <w:ind w:left="2880" w:hanging="360"/>
+      </w:pPr>
+      <w:rPr>
+        <w:rFonts w:hint="default" w:ascii="Symbol" w:hAnsi="Symbol"/>
+      </w:rPr>
+    </w:lvl>
+    <w:lvl xmlns:w="http://schemas.openxmlformats.org/wordprocessingml/2006/main" w:ilvl="4">
+      <w:start w:val="1"/>
+      <w:numFmt w:val="bullet"/>
+      <w:lvlText w:val="o"/>
+      <w:lvlJc w:val="left"/>
+      <w:pPr>
+        <w:ind w:left="3600" w:hanging="360"/>
+      </w:pPr>
+      <w:rPr>
+        <w:rFonts w:hint="default" w:ascii="Courier New" w:hAnsi="Courier New"/>
+      </w:rPr>
+    </w:lvl>
+    <w:lvl xmlns:w="http://schemas.openxmlformats.org/wordprocessingml/2006/main" w:ilvl="5">
+      <w:start w:val="1"/>
+      <w:numFmt w:val="bullet"/>
+      <w:lvlText w:val=""/>
+      <w:lvlJc w:val="left"/>
+      <w:pPr>
+        <w:ind w:left="4320" w:hanging="360"/>
+      </w:pPr>
+      <w:rPr>
+        <w:rFonts w:hint="default" w:ascii="Wingdings" w:hAnsi="Wingdings"/>
+      </w:rPr>
+    </w:lvl>
+    <w:lvl xmlns:w="http://schemas.openxmlformats.org/wordprocessingml/2006/main" w:ilvl="6">
+      <w:start w:val="1"/>
+      <w:numFmt w:val="bullet"/>
+      <w:lvlText w:val=""/>
+      <w:lvlJc w:val="left"/>
+      <w:pPr>
+        <w:ind w:left="5040" w:hanging="360"/>
+      </w:pPr>
+      <w:rPr>
+        <w:rFonts w:hint="default" w:ascii="Symbol" w:hAnsi="Symbol"/>
+      </w:rPr>
+    </w:lvl>
+    <w:lvl xmlns:w="http://schemas.openxmlformats.org/wordprocessingml/2006/main" w:ilvl="7">
+      <w:start w:val="1"/>
+      <w:numFmt w:val="bullet"/>
+      <w:lvlText w:val="o"/>
+      <w:lvlJc w:val="left"/>
+      <w:pPr>
+        <w:ind w:left="5760" w:hanging="360"/>
+      </w:pPr>
+      <w:rPr>
+        <w:rFonts w:hint="default" w:ascii="Courier New" w:hAnsi="Courier New"/>
+      </w:rPr>
+    </w:lvl>
+    <w:lvl xmlns:w="http://schemas.openxmlformats.org/wordprocessingml/2006/main" w:ilvl="8">
+      <w:start w:val="1"/>
+      <w:numFmt w:val="bullet"/>
+      <w:lvlText w:val=""/>
+      <w:lvlJc w:val="left"/>
+      <w:pPr>
+        <w:ind w:left="6480" w:hanging="360"/>
+      </w:pPr>
+      <w:rPr>
+        <w:rFonts w:hint="default" w:ascii="Wingdings" w:hAnsi="Wingdings"/>
+      </w:rPr>
+    </w:lvl>
+  </w:abstractNum>
+  <w:abstractNum xmlns:w="http://schemas.openxmlformats.org/wordprocessingml/2006/main" w:abstractNumId="2">
+    <w:nsid w:val="51698ceb"/>
+    <w:multiLevelType xmlns:w="http://schemas.openxmlformats.org/wordprocessingml/2006/main" w:val="hybridMultilevel"/>
+    <w:lvl xmlns:w="http://schemas.openxmlformats.org/wordprocessingml/2006/main" w:ilvl="0">
+      <w:start w:val="1"/>
+      <w:numFmt w:val="bullet"/>
+      <w:lvlText w:val="-"/>
+      <w:lvlJc w:val="left"/>
+      <w:pPr>
+        <w:ind w:left="720" w:hanging="360"/>
+      </w:pPr>
+      <w:rPr>
+        <w:rFonts w:hint="default" w:ascii="Aptos" w:hAnsi="Aptos"/>
+      </w:rPr>
+    </w:lvl>
+    <w:lvl xmlns:w="http://schemas.openxmlformats.org/wordprocessingml/2006/main" w:ilvl="1">
+      <w:start w:val="1"/>
+      <w:numFmt w:val="bullet"/>
+      <w:lvlText w:val="o"/>
+      <w:lvlJc w:val="left"/>
+      <w:pPr>
+        <w:ind w:left="1440" w:hanging="360"/>
+      </w:pPr>
+      <w:rPr>
+        <w:rFonts w:hint="default" w:ascii="Courier New" w:hAnsi="Courier New"/>
+      </w:rPr>
+    </w:lvl>
+    <w:lvl xmlns:w="http://schemas.openxmlformats.org/wordprocessingml/2006/main" w:ilvl="2">
+      <w:start w:val="1"/>
+      <w:numFmt w:val="bullet"/>
+      <w:lvlText w:val=""/>
+      <w:lvlJc w:val="left"/>
+      <w:pPr>
+        <w:ind w:left="2160" w:hanging="360"/>
+      </w:pPr>
+      <w:rPr>
+        <w:rFonts w:hint="default" w:ascii="Wingdings" w:hAnsi="Wingdings"/>
+      </w:rPr>
+    </w:lvl>
+    <w:lvl xmlns:w="http://schemas.openxmlformats.org/wordprocessingml/2006/main" w:ilvl="3">
+      <w:start w:val="1"/>
+      <w:numFmt w:val="bullet"/>
+      <w:lvlText w:val=""/>
+      <w:lvlJc w:val="left"/>
+      <w:pPr>
+        <w:ind w:left="2880" w:hanging="360"/>
+      </w:pPr>
+      <w:rPr>
+        <w:rFonts w:hint="default" w:ascii="Symbol" w:hAnsi="Symbol"/>
+      </w:rPr>
+    </w:lvl>
+    <w:lvl xmlns:w="http://schemas.openxmlformats.org/wordprocessingml/2006/main" w:ilvl="4">
+      <w:start w:val="1"/>
+      <w:numFmt w:val="bullet"/>
+      <w:lvlText w:val="o"/>
+      <w:lvlJc w:val="left"/>
+      <w:pPr>
+        <w:ind w:left="3600" w:hanging="360"/>
+      </w:pPr>
+      <w:rPr>
+        <w:rFonts w:hint="default" w:ascii="Courier New" w:hAnsi="Courier New"/>
+      </w:rPr>
+    </w:lvl>
+    <w:lvl xmlns:w="http://schemas.openxmlformats.org/wordprocessingml/2006/main" w:ilvl="5">
+      <w:start w:val="1"/>
+      <w:numFmt w:val="bullet"/>
+      <w:lvlText w:val=""/>
+      <w:lvlJc w:val="left"/>
+      <w:pPr>
+        <w:ind w:left="4320" w:hanging="360"/>
+      </w:pPr>
+      <w:rPr>
+        <w:rFonts w:hint="default" w:ascii="Wingdings" w:hAnsi="Wingdings"/>
+      </w:rPr>
+    </w:lvl>
+    <w:lvl xmlns:w="http://schemas.openxmlformats.org/wordprocessingml/2006/main" w:ilvl="6">
+      <w:start w:val="1"/>
+      <w:numFmt w:val="bullet"/>
+      <w:lvlText w:val=""/>
+      <w:lvlJc w:val="left"/>
+      <w:pPr>
+        <w:ind w:left="5040" w:hanging="360"/>
+      </w:pPr>
+      <w:rPr>
+        <w:rFonts w:hint="default" w:ascii="Symbol" w:hAnsi="Symbol"/>
+      </w:rPr>
+    </w:lvl>
+    <w:lvl xmlns:w="http://schemas.openxmlformats.org/wordprocessingml/2006/main" w:ilvl="7">
+      <w:start w:val="1"/>
+      <w:numFmt w:val="bullet"/>
+      <w:lvlText w:val="o"/>
+      <w:lvlJc w:val="left"/>
+      <w:pPr>
+        <w:ind w:left="5760" w:hanging="360"/>
+      </w:pPr>
+      <w:rPr>
+        <w:rFonts w:hint="default" w:ascii="Courier New" w:hAnsi="Courier New"/>
+      </w:rPr>
+    </w:lvl>
+    <w:lvl xmlns:w="http://schemas.openxmlformats.org/wordprocessingml/2006/main" w:ilvl="8">
+      <w:start w:val="1"/>
+      <w:numFmt w:val="bullet"/>
+      <w:lvlText w:val=""/>
+      <w:lvlJc w:val="left"/>
+      <w:pPr>
+        <w:ind w:left="6480" w:hanging="360"/>
+      </w:pPr>
+      <w:rPr>
+        <w:rFonts w:hint="default" w:ascii="Wingdings" w:hAnsi="Wingdings"/>
+      </w:rPr>
+    </w:lvl>
+  </w:abstractNum>
   <w:abstractNum xmlns:w="http://schemas.openxmlformats.org/wordprocessingml/2006/main" w:abstractNumId="1">
     <w:nsid w:val="4ca4edef"/>
     <w:multiLevelType xmlns:w="http://schemas.openxmlformats.org/wordprocessingml/2006/main" w:val="hybridMultilevel"/>
@@ -577,6 +931,12 @@
       </w:rPr>
     </w:lvl>
   </w:abstractNum>
+  <w:num w:numId="3">
+    <w:abstractNumId w:val="3"/>
+  </w:num>
+  <w:num w:numId="2">
+    <w:abstractNumId w:val="2"/>
+  </w:num>
   <w:num w:numId="1">
     <w:abstractNumId w:val="1"/>
   </w:num>

</xml_diff>